<commit_message>
folio tasks week 3 and 4: added pdf version of report + github history onto the report
</commit_message>
<xml_diff>
--- a/folio_tasks/documents/eFolio - Week 3 & 4.docx
+++ b/folio_tasks/documents/eFolio - Week 3 & 4.docx
@@ -284,6 +284,59 @@
                     <a:ln>
                       <a:noFill/>
                     </a:ln>
+                  </pic:spPr>
+                </pic:pic>
+              </a:graphicData>
+            </a:graphic>
+          </wp:inline>
+        </w:drawing>
+      </w:r>
+    </w:p>
+    <w:p>
+      <w:r>
+        <w:br w:type="page"/>
+      </w:r>
+    </w:p>
+    <w:p>
+      <w:pPr>
+        <w:pStyle w:val="Heading2"/>
+      </w:pPr>
+      <w:r>
+        <w:lastRenderedPageBreak/>
+        <w:t>Github History</w:t>
+      </w:r>
+    </w:p>
+    <w:p>
+      <w:r>
+        <w:drawing>
+          <wp:inline distT="0" distB="0" distL="0" distR="0" wp14:anchorId="4C77890C" wp14:editId="7AC0C284">
+            <wp:extent cx="5943600" cy="4245610"/>
+            <wp:effectExtent l="0" t="0" r="0" b="2540"/>
+            <wp:docPr id="1745696869" name="Picture 1"/>
+            <wp:cNvGraphicFramePr>
+              <a:graphicFrameLocks xmlns:a="http://schemas.openxmlformats.org/drawingml/2006/main" noChangeAspect="1"/>
+            </wp:cNvGraphicFramePr>
+            <a:graphic xmlns:a="http://schemas.openxmlformats.org/drawingml/2006/main">
+              <a:graphicData uri="http://schemas.openxmlformats.org/drawingml/2006/picture">
+                <pic:pic xmlns:pic="http://schemas.openxmlformats.org/drawingml/2006/picture">
+                  <pic:nvPicPr>
+                    <pic:cNvPr id="1745696869" name=""/>
+                    <pic:cNvPicPr/>
+                  </pic:nvPicPr>
+                  <pic:blipFill>
+                    <a:blip r:embed="rId9"/>
+                    <a:stretch>
+                      <a:fillRect/>
+                    </a:stretch>
+                  </pic:blipFill>
+                  <pic:spPr>
+                    <a:xfrm>
+                      <a:off x="0" y="0"/>
+                      <a:ext cx="5943600" cy="4245610"/>
+                    </a:xfrm>
+                    <a:prstGeom prst="rect">
+                      <a:avLst/>
+                    </a:prstGeom>
                   </pic:spPr>
                 </pic:pic>
               </a:graphicData>
@@ -853,7 +906,6 @@
     <w:next w:val="Normal"/>
     <w:link w:val="Heading2Char"/>
     <w:uiPriority w:val="9"/>
-    <w:semiHidden/>
     <w:unhideWhenUsed/>
     <w:qFormat/>
     <w:rsid w:val="00AC038D"/>
@@ -1071,7 +1123,6 @@
     <w:basedOn w:val="DefaultParagraphFont"/>
     <w:link w:val="Heading2"/>
     <w:uiPriority w:val="9"/>
-    <w:semiHidden/>
     <w:rsid w:val="00AC038D"/>
     <w:rPr>
       <w:rFonts w:asciiTheme="majorHAnsi" w:eastAsiaTheme="majorEastAsia" w:hAnsiTheme="majorHAnsi" w:cstheme="majorBidi"/>

</xml_diff>